<commit_message>
Document for this ML
</commit_message>
<xml_diff>
--- a/Telco Project.docx
+++ b/Telco Project.docx
@@ -3286,6 +3286,14 @@
               </w:rPr>
               <w:t>0</w:t>
             </w:r>
+            <w:r>
+              <w:rPr>
+                <w:rFonts w:ascii="TH Sarabun New" w:hAnsi="TH Sarabun New" w:cs="TH Sarabun New"/>
+                <w:sz w:val="28"/>
+                <w:szCs w:val="28"/>
+              </w:rPr>
+              <w:t>.0</w:t>
+            </w:r>
           </w:p>
         </w:tc>
         <w:tc>
@@ -3308,6 +3316,14 @@
                 <w:szCs w:val="28"/>
               </w:rPr>
               <w:t>0</w:t>
+            </w:r>
+            <w:r>
+              <w:rPr>
+                <w:rFonts w:ascii="TH Sarabun New" w:hAnsi="TH Sarabun New" w:cs="TH Sarabun New"/>
+                <w:sz w:val="28"/>
+                <w:szCs w:val="28"/>
+              </w:rPr>
+              <w:t>.0</w:t>
             </w:r>
           </w:p>
         </w:tc>
@@ -3380,6 +3396,14 @@
               </w:rPr>
               <w:t>0</w:t>
             </w:r>
+            <w:r>
+              <w:rPr>
+                <w:rFonts w:ascii="TH Sarabun New" w:hAnsi="TH Sarabun New" w:cs="TH Sarabun New"/>
+                <w:sz w:val="28"/>
+                <w:szCs w:val="28"/>
+              </w:rPr>
+              <w:t>.0</w:t>
+            </w:r>
           </w:p>
         </w:tc>
         <w:tc>
@@ -3402,6 +3426,14 @@
                 <w:szCs w:val="28"/>
               </w:rPr>
               <w:t>9</w:t>
+            </w:r>
+            <w:r>
+              <w:rPr>
+                <w:rFonts w:ascii="TH Sarabun New" w:hAnsi="TH Sarabun New" w:cs="TH Sarabun New"/>
+                <w:sz w:val="28"/>
+                <w:szCs w:val="28"/>
+              </w:rPr>
+              <w:t>.0</w:t>
             </w:r>
           </w:p>
         </w:tc>
@@ -3474,6 +3506,14 @@
               </w:rPr>
               <w:t>0</w:t>
             </w:r>
+            <w:r>
+              <w:rPr>
+                <w:rFonts w:ascii="TH Sarabun New" w:hAnsi="TH Sarabun New" w:cs="TH Sarabun New"/>
+                <w:sz w:val="28"/>
+                <w:szCs w:val="28"/>
+              </w:rPr>
+              <w:t>.0</w:t>
+            </w:r>
           </w:p>
         </w:tc>
         <w:tc>
@@ -3568,6 +3608,14 @@
               </w:rPr>
               <w:t>0</w:t>
             </w:r>
+            <w:r>
+              <w:rPr>
+                <w:rFonts w:ascii="TH Sarabun New" w:hAnsi="TH Sarabun New" w:cs="TH Sarabun New"/>
+                <w:sz w:val="28"/>
+                <w:szCs w:val="28"/>
+              </w:rPr>
+              <w:t>.0</w:t>
+            </w:r>
           </w:p>
         </w:tc>
         <w:tc>
@@ -3661,6 +3709,14 @@
                 <w:szCs w:val="28"/>
               </w:rPr>
               <w:t>1</w:t>
+            </w:r>
+            <w:r>
+              <w:rPr>
+                <w:rFonts w:ascii="TH Sarabun New" w:hAnsi="TH Sarabun New" w:cs="TH Sarabun New"/>
+                <w:sz w:val="28"/>
+                <w:szCs w:val="28"/>
+              </w:rPr>
+              <w:t>.0</w:t>
             </w:r>
           </w:p>
         </w:tc>

</xml_diff>